<commit_message>
W 11-04: smooth bridges into OmniWatch and Chapter instead of next-teases; CLAUDE.md: standing producer rule for sponsor transitions
Co-Authored-By: Claude Opus 5.5 <noreply@anthropic.com>
Claude-Session: https://claude.ai/code/session_01DKKidkeUDmopBGagqb23YG
</commit_message>
<xml_diff>
--- a/runs/W_11042026/11_04 LIVE BIBLE.docx
+++ b/runs/W_11042026/11_04 LIVE BIBLE.docx
@@ -4167,7 +4167,88 @@
           <w:color w:val="000000"/>
           <w:sz w:val="36"/>
         </w:rPr>
-        <w:t xml:space="preserve">-NEXT… THE FTC AND 20 STATES ARE SUING </w:t>
+        <w:t>-AND REMEMBER THAT FATHER AND SON? ALL THEY NEEDED WAS A NAME. AN ADDRESS. AND SOME FORGED PAPERWORK.</w:t>
+      </w:r>
+    </w:p>
+    <w:p>
+      <w:pPr>
+        <w:spacing w:lineRule="auto" w:line="276" w:before="0" w:after="0"/>
+      </w:pPr>
+      <w:r>
+        <w:rPr>
+          <w:rFonts w:ascii="Arial" w:hAnsi="Arial" w:cs="Arial" w:eastAsia="Arial"/>
+          <w:b w:val="0"/>
+          <w:color w:val="000000"/>
+          <w:sz w:val="36"/>
+        </w:rPr>
+      </w:r>
+    </w:p>
+    <w:p>
+      <w:pPr>
+        <w:spacing w:lineRule="auto" w:line="276" w:before="0" w:after="0"/>
+      </w:pPr>
+      <w:r>
+        <w:rPr>
+          <w:rFonts w:ascii="Arial" w:hAnsi="Arial" w:cs="Arial" w:eastAsia="Arial"/>
+          <w:b w:val="0"/>
+          <w:color w:val="000000"/>
+          <w:sz w:val="36"/>
+        </w:rPr>
+        <w:t>-NOW IMAGINE A STRANGER ALREADY HAS YOURS… FROM A DATA BREACH.</w:t>
+      </w:r>
+    </w:p>
+    <w:p>
+      <w:pPr>
+        <w:spacing w:lineRule="auto" w:line="276" w:before="0" w:after="0"/>
+      </w:pPr>
+      <w:r>
+        <w:rPr>
+          <w:rFonts w:ascii="Arial" w:hAnsi="Arial" w:cs="Arial" w:eastAsia="Arial"/>
+          <w:b w:val="0"/>
+          <w:color w:val="000000"/>
+          <w:sz w:val="36"/>
+        </w:rPr>
+      </w:r>
+    </w:p>
+    <w:p>
+      <w:pPr>
+        <w:spacing w:lineRule="auto" w:line="276" w:before="0" w:after="0"/>
+      </w:pPr>
+      <w:r>
+        <w:rPr>
+          <w:rFonts w:ascii="Arial" w:hAnsi="Arial" w:cs="Arial" w:eastAsia="Arial"/>
+          <w:b w:val="0"/>
+          <w:color w:val="000000"/>
+          <w:sz w:val="36"/>
+        </w:rPr>
+        <w:t>-YOU'D WANT TO KNOW IF YOUR INFORMATION IS OUT THERE.</w:t>
+      </w:r>
+    </w:p>
+    <w:p>
+      <w:pPr>
+        <w:spacing w:lineRule="auto" w:line="276" w:before="0" w:after="0"/>
+      </w:pPr>
+      <w:r>
+        <w:rPr>
+          <w:rFonts w:ascii="Arial" w:hAnsi="Arial" w:cs="Arial" w:eastAsia="Arial"/>
+          <w:b w:val="0"/>
+          <w:color w:val="000000"/>
+          <w:sz w:val="36"/>
+        </w:rPr>
+      </w:r>
+    </w:p>
+    <w:p>
+      <w:pPr>
+        <w:spacing w:lineRule="auto" w:line="276" w:before="0" w:after="0"/>
+      </w:pPr>
+      <w:r>
+        <w:rPr>
+          <w:rFonts w:ascii="Arial" w:hAnsi="Arial" w:cs="Arial" w:eastAsia="Arial"/>
+          <w:b w:val="0"/>
+          <w:color w:val="000000"/>
+          <w:sz w:val="36"/>
+        </w:rPr>
+        <w:t xml:space="preserve">-THAT'S WHERE OUR SPONSOR, </w:t>
       </w:r>
       <w:r>
         <w:rPr>
@@ -4176,70 +4257,16 @@
           <w:color w:val="000000"/>
           <w:sz w:val="36"/>
         </w:rPr>
-        <w:t>DOLLAR GENERAL</w:t>
-      </w:r>
-      <w:r>
-        <w:rPr>
-          <w:rFonts w:ascii="Arial" w:hAnsi="Arial" w:cs="Arial" w:eastAsia="Arial"/>
-          <w:b w:val="0"/>
-          <w:color w:val="000000"/>
-          <w:sz w:val="36"/>
-        </w:rPr>
-        <w:t>. IT COULD BE HAPPENING EVERY TIME YOU CHECK OUT.</w:t>
-      </w:r>
-    </w:p>
-    <w:p>
-      <w:pPr>
-        <w:spacing w:lineRule="auto" w:line="276" w:before="0" w:after="0"/>
-      </w:pPr>
-      <w:r>
-        <w:rPr>
-          <w:rFonts w:ascii="Arial" w:hAnsi="Arial" w:cs="Arial" w:eastAsia="Arial"/>
-          <w:b w:val="0"/>
-          <w:color w:val="000000"/>
-          <w:sz w:val="36"/>
-        </w:rPr>
-      </w:r>
-    </w:p>
-    <w:p>
-      <w:pPr>
-        <w:spacing w:lineRule="auto" w:line="276" w:before="0" w:after="0"/>
-      </w:pPr>
-      <w:r>
-        <w:rPr>
-          <w:rFonts w:ascii="Arial" w:hAnsi="Arial" w:cs="Arial" w:eastAsia="Arial"/>
-          <w:b w:val="0"/>
-          <w:color w:val="000000"/>
-          <w:sz w:val="36"/>
-        </w:rPr>
-        <w:t>-AND ONE MAN'S RECEIPTS GOT EVERY STORE IN HIS COUNTY INSPECTED.</w:t>
-      </w:r>
-    </w:p>
-    <w:p>
-      <w:pPr>
-        <w:spacing w:lineRule="auto" w:line="276" w:before="0" w:after="0"/>
-      </w:pPr>
-      <w:r>
-        <w:rPr>
-          <w:rFonts w:ascii="Arial" w:hAnsi="Arial" w:cs="Arial" w:eastAsia="Arial"/>
-          <w:b w:val="0"/>
-          <w:color w:val="000000"/>
-          <w:sz w:val="36"/>
-        </w:rPr>
-      </w:r>
-    </w:p>
-    <w:p>
-      <w:pPr>
-        <w:spacing w:lineRule="auto" w:line="276" w:before="0" w:after="0"/>
-      </w:pPr>
-      <w:r>
-        <w:rPr>
-          <w:rFonts w:ascii="Arial" w:hAnsi="Arial" w:cs="Arial" w:eastAsia="Arial"/>
-          <w:b w:val="0"/>
-          <w:color w:val="000000"/>
-          <w:sz w:val="36"/>
-        </w:rPr>
-        <w:t>-BUT FIRST, A QUICK WORD FROM OUR SPONSOR.</w:t>
+        <w:t>OMNIWATCH</w:t>
+      </w:r>
+      <w:r>
+        <w:rPr>
+          <w:rFonts w:ascii="Arial" w:hAnsi="Arial" w:cs="Arial" w:eastAsia="Arial"/>
+          <w:b w:val="0"/>
+          <w:color w:val="000000"/>
+          <w:sz w:val="36"/>
+        </w:rPr>
+        <w:t>, COMES IN.</w:t>
       </w:r>
     </w:p>
     <w:p>
@@ -5799,61 +5826,142 @@
           <w:color w:val="000000"/>
           <w:sz w:val="36"/>
         </w:rPr>
-        <w:t>-NEXT… A FORMER DOLLAR GENERAL EMPLOYEE TELLS YOU WHY NOBODY FIXES THE PRICE.</w:t>
-      </w:r>
-    </w:p>
-    <w:p>
-      <w:pPr>
-        <w:spacing w:lineRule="auto" w:line="276" w:before="0" w:after="0"/>
-      </w:pPr>
-      <w:r>
-        <w:rPr>
-          <w:rFonts w:ascii="Arial" w:hAnsi="Arial" w:cs="Arial" w:eastAsia="Arial"/>
-          <w:b w:val="0"/>
-          <w:color w:val="000000"/>
-          <w:sz w:val="36"/>
-        </w:rPr>
-      </w:r>
-    </w:p>
-    <w:p>
-      <w:pPr>
-        <w:spacing w:lineRule="auto" w:line="276" w:before="0" w:after="0"/>
-      </w:pPr>
-      <w:r>
-        <w:rPr>
-          <w:rFonts w:ascii="Arial" w:hAnsi="Arial" w:cs="Arial" w:eastAsia="Arial"/>
-          <w:b w:val="0"/>
-          <w:color w:val="000000"/>
-          <w:sz w:val="36"/>
-        </w:rPr>
-        <w:t>-AND IT'S STILL HAPPENING RIGHT NOW. IN ONE STATE, SECRET SHOPPERS GOT OVERCHARGED AGAIN AND AGAIN.</w:t>
-      </w:r>
-    </w:p>
-    <w:p>
-      <w:pPr>
-        <w:spacing w:lineRule="auto" w:line="276" w:before="0" w:after="0"/>
-      </w:pPr>
-      <w:r>
-        <w:rPr>
-          <w:rFonts w:ascii="Arial" w:hAnsi="Arial" w:cs="Arial" w:eastAsia="Arial"/>
-          <w:b w:val="0"/>
-          <w:color w:val="000000"/>
-          <w:sz w:val="36"/>
-        </w:rPr>
-      </w:r>
-    </w:p>
-    <w:p>
-      <w:pPr>
-        <w:spacing w:lineRule="auto" w:line="276" w:before="0" w:after="0"/>
-      </w:pPr>
-      <w:r>
-        <w:rPr>
-          <w:rFonts w:ascii="Arial" w:hAnsi="Arial" w:cs="Arial" w:eastAsia="Arial"/>
-          <w:b w:val="0"/>
-          <w:color w:val="000000"/>
-          <w:sz w:val="36"/>
-        </w:rPr>
-        <w:t>-BUT FIRST, A QUICK WORD FROM OUR SPONSOR.</w:t>
+        <w:t>-HE CAUGHT IT BECAUSE HE CHECKED WHAT HE WAS PAYING.</w:t>
+      </w:r>
+    </w:p>
+    <w:p>
+      <w:pPr>
+        <w:spacing w:lineRule="auto" w:line="276" w:before="0" w:after="0"/>
+      </w:pPr>
+      <w:r>
+        <w:rPr>
+          <w:rFonts w:ascii="Arial" w:hAnsi="Arial" w:cs="Arial" w:eastAsia="Arial"/>
+          <w:b w:val="0"/>
+          <w:color w:val="000000"/>
+          <w:sz w:val="36"/>
+        </w:rPr>
+      </w:r>
+    </w:p>
+    <w:p>
+      <w:pPr>
+        <w:spacing w:lineRule="auto" w:line="276" w:before="0" w:after="0"/>
+      </w:pPr>
+      <w:r>
+        <w:rPr>
+          <w:rFonts w:ascii="Arial" w:hAnsi="Arial" w:cs="Arial" w:eastAsia="Arial"/>
+          <w:b w:val="0"/>
+          <w:color w:val="000000"/>
+          <w:sz w:val="36"/>
+        </w:rPr>
+        <w:t xml:space="preserve">-AND HERE'S ANOTHER BILL A LOT OF US NEVER CHECK… OUR </w:t>
+      </w:r>
+      <w:r>
+        <w:rPr>
+          <w:rFonts w:ascii="Arial" w:hAnsi="Arial" w:cs="Arial" w:eastAsia="Arial"/>
+          <w:b/>
+          <w:color w:val="000000"/>
+          <w:sz w:val="36"/>
+        </w:rPr>
+        <w:t>MEDICARE</w:t>
+      </w:r>
+      <w:r>
+        <w:rPr>
+          <w:rFonts w:ascii="Arial" w:hAnsi="Arial" w:cs="Arial" w:eastAsia="Arial"/>
+          <w:b w:val="0"/>
+          <w:color w:val="000000"/>
+          <w:sz w:val="36"/>
+        </w:rPr>
+        <w:t xml:space="preserve"> PLAN.</w:t>
+      </w:r>
+    </w:p>
+    <w:p>
+      <w:pPr>
+        <w:spacing w:lineRule="auto" w:line="276" w:before="0" w:after="0"/>
+      </w:pPr>
+      <w:r>
+        <w:rPr>
+          <w:rFonts w:ascii="Arial" w:hAnsi="Arial" w:cs="Arial" w:eastAsia="Arial"/>
+          <w:b w:val="0"/>
+          <w:color w:val="000000"/>
+          <w:sz w:val="36"/>
+        </w:rPr>
+      </w:r>
+    </w:p>
+    <w:p>
+      <w:pPr>
+        <w:spacing w:lineRule="auto" w:line="276" w:before="0" w:after="0"/>
+      </w:pPr>
+      <w:r>
+        <w:rPr>
+          <w:rFonts w:ascii="Arial" w:hAnsi="Arial" w:cs="Arial" w:eastAsia="Arial"/>
+          <w:b w:val="0"/>
+          <w:color w:val="000000"/>
+          <w:sz w:val="36"/>
+        </w:rPr>
+        <w:t xml:space="preserve">-OPEN ENROLLMENT IS HAPPENING RIGHT NOW. IT ENDS </w:t>
+      </w:r>
+      <w:r>
+        <w:rPr>
+          <w:rFonts w:ascii="Arial" w:hAnsi="Arial" w:cs="Arial" w:eastAsia="Arial"/>
+          <w:b/>
+          <w:color w:val="000000"/>
+          <w:sz w:val="36"/>
+        </w:rPr>
+        <w:t>DECEMBER 7</w:t>
+      </w:r>
+      <w:r>
+        <w:rPr>
+          <w:rFonts w:ascii="Arial" w:hAnsi="Arial" w:cs="Arial" w:eastAsia="Arial"/>
+          <w:b w:val="0"/>
+          <w:color w:val="000000"/>
+          <w:sz w:val="36"/>
+        </w:rPr>
+        <w:t>.</w:t>
+      </w:r>
+    </w:p>
+    <w:p>
+      <w:pPr>
+        <w:spacing w:lineRule="auto" w:line="276" w:before="0" w:after="0"/>
+      </w:pPr>
+      <w:r>
+        <w:rPr>
+          <w:rFonts w:ascii="Arial" w:hAnsi="Arial" w:cs="Arial" w:eastAsia="Arial"/>
+          <w:b w:val="0"/>
+          <w:color w:val="000000"/>
+          <w:sz w:val="36"/>
+        </w:rPr>
+      </w:r>
+    </w:p>
+    <w:p>
+      <w:pPr>
+        <w:spacing w:lineRule="auto" w:line="276" w:before="0" w:after="0"/>
+      </w:pPr>
+      <w:r>
+        <w:rPr>
+          <w:rFonts w:ascii="Arial" w:hAnsi="Arial" w:cs="Arial" w:eastAsia="Arial"/>
+          <w:b w:val="0"/>
+          <w:color w:val="000000"/>
+          <w:sz w:val="36"/>
+        </w:rPr>
+        <w:t xml:space="preserve">-OUR SPONSOR, </w:t>
+      </w:r>
+      <w:r>
+        <w:rPr>
+          <w:rFonts w:ascii="Arial" w:hAnsi="Arial" w:cs="Arial" w:eastAsia="Arial"/>
+          <w:b/>
+          <w:color w:val="000000"/>
+          <w:sz w:val="36"/>
+        </w:rPr>
+        <w:t>CHAPTER</w:t>
+      </w:r>
+      <w:r>
+        <w:rPr>
+          <w:rFonts w:ascii="Arial" w:hAnsi="Arial" w:cs="Arial" w:eastAsia="Arial"/>
+          <w:b w:val="0"/>
+          <w:color w:val="000000"/>
+          <w:sz w:val="36"/>
+        </w:rPr>
+        <w:t>, CAN HELP YOU TAKE A SECOND LOOK.</w:t>
       </w:r>
     </w:p>
     <w:p>
@@ -5934,7 +6042,7 @@
           <w:color w:val="FF0000"/>
           <w:sz w:val="36"/>
         </w:rPr>
-        <w:t>(((PRODUCER - CHAPTER TALKING POINTS AND ANY READ-VERBATIM LINES STILL TO COME. BRIDGE IDEA: MEDICARE OPEN ENROLLMENT RUNS OCT 15 TO DEC 7)))</w:t>
+        <w:t>(((PRODUCER - CHAPTER TALKING POINTS AND ANY READ-VERBATIM LINES STILL TO COME. CHECK THE BRIDGE AGAINST THEM)))</w:t>
       </w:r>
     </w:p>
     <w:p>
@@ -8155,7 +8263,7 @@
 
 <file path=word/comments.xml><?xml version="1.0" encoding="utf-8"?>
 <w:comments xmlns:a="http://schemas.openxmlformats.org/drawingml/2006/main" xmlns:pic="http://schemas.openxmlformats.org/drawingml/2006/picture" xmlns:r="http://schemas.openxmlformats.org/officeDocument/2006/relationships" xmlns:w="http://schemas.openxmlformats.org/wordprocessingml/2006/main" xmlns:wp="http://schemas.openxmlformats.org/drawingml/2006/wordprocessingDrawing" xmlns:mc="http://schemas.openxmlformats.org/markup-compatibility/2006" xmlns:a14="http://schemas.microsoft.com/office/drawing/2010/main" xmlns:w14="http://schemas.microsoft.com/office/word/2010/wordml" xmlns:wpc="http://schemas.microsoft.com/office/word/2010/wordprocessingCanvas">
-  <w:comment w:id="0" w:author="Claude" w:initials="C" w:date="2026-10-28T01:22:47Z">
+  <w:comment w:id="0" w:author="Claude" w:initials="C" w:date="2026-10-28T01:24:41Z">
     <w:p>
       <w:pPr>
         <w:pStyle w:val="CommentText"/>
@@ -8171,7 +8279,7 @@
       </w:r>
     </w:p>
   </w:comment>
-  <w:comment w:id="1" w:author="Claude" w:initials="C" w:date="2026-10-28T01:22:47Z">
+  <w:comment w:id="1" w:author="Claude" w:initials="C" w:date="2026-10-28T01:24:41Z">
     <w:p>
       <w:pPr>
         <w:pStyle w:val="CommentText"/>
@@ -8187,7 +8295,7 @@
       </w:r>
     </w:p>
   </w:comment>
-  <w:comment w:id="2" w:author="Claude" w:initials="C" w:date="2026-10-28T01:22:47Z">
+  <w:comment w:id="2" w:author="Claude" w:initials="C" w:date="2026-10-28T01:24:41Z">
     <w:p>
       <w:pPr>
         <w:pStyle w:val="CommentText"/>
@@ -8203,7 +8311,7 @@
       </w:r>
     </w:p>
   </w:comment>
-  <w:comment w:id="3" w:author="Claude" w:initials="C" w:date="2026-10-28T01:22:48Z">
+  <w:comment w:id="3" w:author="Claude" w:initials="C" w:date="2026-10-28T01:24:41Z">
     <w:p>
       <w:pPr>
         <w:pStyle w:val="CommentText"/>
@@ -8219,7 +8327,7 @@
       </w:r>
     </w:p>
   </w:comment>
-  <w:comment w:id="4" w:author="Claude" w:initials="C" w:date="2026-10-28T01:22:48Z">
+  <w:comment w:id="4" w:author="Claude" w:initials="C" w:date="2026-10-28T01:24:41Z">
     <w:p>
       <w:pPr>
         <w:pStyle w:val="CommentText"/>
@@ -8235,7 +8343,7 @@
       </w:r>
     </w:p>
   </w:comment>
-  <w:comment w:id="5" w:author="Claude" w:initials="C" w:date="2026-10-28T01:22:48Z">
+  <w:comment w:id="5" w:author="Claude" w:initials="C" w:date="2026-10-28T01:24:41Z">
     <w:p>
       <w:pPr>
         <w:pStyle w:val="CommentText"/>
@@ -8251,7 +8359,7 @@
       </w:r>
     </w:p>
   </w:comment>
-  <w:comment w:id="6" w:author="Claude" w:initials="C" w:date="2026-10-28T01:22:48Z">
+  <w:comment w:id="6" w:author="Claude" w:initials="C" w:date="2026-10-28T01:24:41Z">
     <w:p>
       <w:pPr>
         <w:pStyle w:val="CommentText"/>
@@ -8267,7 +8375,7 @@
       </w:r>
     </w:p>
   </w:comment>
-  <w:comment w:id="7" w:author="Claude" w:initials="C" w:date="2026-10-28T01:22:48Z">
+  <w:comment w:id="7" w:author="Claude" w:initials="C" w:date="2026-10-28T01:24:41Z">
     <w:p>
       <w:pPr>
         <w:pStyle w:val="CommentText"/>
@@ -8283,7 +8391,7 @@
       </w:r>
     </w:p>
   </w:comment>
-  <w:comment w:id="8" w:author="Claude" w:initials="C" w:date="2026-10-28T01:22:48Z">
+  <w:comment w:id="8" w:author="Claude" w:initials="C" w:date="2026-10-28T01:24:41Z">
     <w:p>
       <w:pPr>
         <w:pStyle w:val="CommentText"/>
@@ -8299,7 +8407,7 @@
       </w:r>
     </w:p>
   </w:comment>
-  <w:comment w:id="9" w:author="Claude" w:initials="C" w:date="2026-10-28T01:22:48Z">
+  <w:comment w:id="9" w:author="Claude" w:initials="C" w:date="2026-10-28T01:24:41Z">
     <w:p>
       <w:pPr>
         <w:pStyle w:val="CommentText"/>
@@ -8315,7 +8423,7 @@
       </w:r>
     </w:p>
   </w:comment>
-  <w:comment w:id="10" w:author="Claude" w:initials="C" w:date="2026-10-28T01:22:48Z">
+  <w:comment w:id="10" w:author="Claude" w:initials="C" w:date="2026-10-28T01:24:41Z">
     <w:p>
       <w:pPr>
         <w:pStyle w:val="CommentText"/>
@@ -8331,7 +8439,7 @@
       </w:r>
     </w:p>
   </w:comment>
-  <w:comment w:id="11" w:author="Claude" w:initials="C" w:date="2026-10-28T01:22:48Z">
+  <w:comment w:id="11" w:author="Claude" w:initials="C" w:date="2026-10-28T01:24:41Z">
     <w:p>
       <w:pPr>
         <w:pStyle w:val="CommentText"/>
@@ -8347,7 +8455,7 @@
       </w:r>
     </w:p>
   </w:comment>
-  <w:comment w:id="12" w:author="Claude" w:initials="C" w:date="2026-10-28T01:22:48Z">
+  <w:comment w:id="12" w:author="Claude" w:initials="C" w:date="2026-10-28T01:24:41Z">
     <w:p>
       <w:pPr>
         <w:pStyle w:val="CommentText"/>

</xml_diff>